<commit_message>
Point the project at the fretaid repository
Co-Authored-By: Claude Opus 5.5 <noreply@anthropic.com>
</commit_message>
<xml_diff>
--- a/docs/FretAid-report.docx
+++ b/docs/FretAid-report.docx
@@ -655,25 +655,37 @@
         <w:t xml:space="preserve"> </w:t>
       </w:r>
       <w:r>
-        <w:t xml:space="preserve">code and in the documentation was changed. Three things deliberately were</w:t>
-      </w:r>
-      <w:r>
-        <w:t xml:space="preserve"> </w:t>
-      </w:r>
-      <w:r>
-        <w:t xml:space="preserve">not: the logo inside the instrument drawings, which is the owner’s to</w:t>
-      </w:r>
-      <w:r>
-        <w:t xml:space="preserve"> </w:t>
-      </w:r>
-      <w:r>
-        <w:t xml:space="preserve">redraw; the project folder; and the GitHub repository, whose address the</w:t>
-      </w:r>
-      <w:r>
-        <w:t xml:space="preserve"> </w:t>
-      </w:r>
-      <w:r>
-        <w:t xml:space="preserve">live site is served from. Settings saved under the old name are still read,</w:t>
+        <w:t xml:space="preserve">code and in the documentation was changed, and the project moved to a new</w:t>
+      </w:r>
+      <w:r>
+        <w:t xml:space="preserve"> </w:t>
+      </w:r>
+      <w:r>
+        <w:t xml:space="preserve">GitHub repository,</w:t>
+      </w:r>
+      <w:r>
+        <w:t xml:space="preserve"> </w:t>
+      </w:r>
+      <w:r>
+        <w:rPr>
+          <w:rStyle w:val="VerbatimChar"/>
+        </w:rPr>
+        <w:t xml:space="preserve">fretaid</w:t>
+      </w:r>
+      <w:r>
+        <w:t xml:space="preserve">. Two things deliberately were not renamed: the</w:t>
+      </w:r>
+      <w:r>
+        <w:t xml:space="preserve"> </w:t>
+      </w:r>
+      <w:r>
+        <w:t xml:space="preserve">logo inside the instrument drawings, which is the owner’s to redraw, and the</w:t>
+      </w:r>
+      <w:r>
+        <w:t xml:space="preserve"> </w:t>
+      </w:r>
+      <w:r>
+        <w:t xml:space="preserve">project folder on disk. Settings saved under the old name are still read,</w:t>
       </w:r>
       <w:r>
         <w:t xml:space="preserve"> </w:t>

</xml_diff>